<commit_message>
Doksi javítás, PPT feltölés (v1)
</commit_message>
<xml_diff>
--- a/Projekt.docx
+++ b/Projekt.docx
@@ -28,8 +28,6 @@
         </w:rPr>
         <w:t>Szállás</w:t>
       </w:r>
-      <w:bookmarkStart w:id="0" w:name="_GoBack"/>
-      <w:bookmarkEnd w:id="0"/>
     </w:p>
     <w:p>
       <w:pPr>
@@ -97,7 +95,33 @@
         <w:t>Szállás</w:t>
       </w:r>
       <w:r>
-        <w:t xml:space="preserve"> egy absztrakt alaposztály. Ebből származnak a konkrét szállástípusok, mint a </w:t>
+        <w:t xml:space="preserve"> egy absztrakt alaposztály.</w:t>
+      </w:r>
+      <w:r>
+        <w:t xml:space="preserve"> Ebből származtatott kettő osztály a </w:t>
+      </w:r>
+      <w:r>
+        <w:rPr>
+          <w:b/>
+        </w:rPr>
+        <w:t>Nyitottszállás</w:t>
+      </w:r>
+      <w:r>
+        <w:t xml:space="preserve">, illetve a </w:t>
+      </w:r>
+      <w:r>
+        <w:rPr>
+          <w:b/>
+        </w:rPr>
+        <w:t>Magánszállás</w:t>
+      </w:r>
+      <w:r>
+        <w:t>.</w:t>
+      </w:r>
+      <w:bookmarkStart w:id="0" w:name="_GoBack"/>
+      <w:bookmarkEnd w:id="0"/>
+      <w:r>
+        <w:t xml:space="preserve"> Ebből származnak a konkrét szállástípusok, mint a </w:t>
       </w:r>
       <w:r>
         <w:rPr>
@@ -549,15 +573,45 @@
         <w:t xml:space="preserve">A projektben résztvevő személyek: </w:t>
       </w:r>
       <w:r>
-        <w:t xml:space="preserve">Dóczi Adrián Márk, </w:t>
+        <w:t>Dóczi Adrián Márk, Bujáki Erik Attila.</w:t>
+      </w:r>
+    </w:p>
+    <w:p>
+      <w:pPr>
+        <w:pStyle w:val="NormlWeb"/>
+      </w:pPr>
+      <w:r>
+        <w:t xml:space="preserve">Dóczi Adrián Márk: </w:t>
       </w:r>
       <w:proofErr w:type="spellStart"/>
       <w:r>
-        <w:t>Bujáki</w:t>
+        <w:t>Material</w:t>
       </w:r>
       <w:proofErr w:type="spellEnd"/>
       <w:r>
-        <w:t xml:space="preserve"> Erik Attila.</w:t>
+        <w:t xml:space="preserve"> UI Design implementálása, Navigációs menü, Dinamikus betöltés, Gombok hozzáadása, Gombok stílusának konfigurálása,</w:t>
+      </w:r>
+      <w:r>
+        <w:t xml:space="preserve"> saját </w:t>
+      </w:r>
+      <w:proofErr w:type="spellStart"/>
+      <w:r>
+        <w:t>árképzési</w:t>
+      </w:r>
+      <w:proofErr w:type="spellEnd"/>
+      <w:r>
+        <w:t xml:space="preserve"> logika,</w:t>
+      </w:r>
+      <w:r>
+        <w:t xml:space="preserve"> fő Szállás </w:t>
+      </w:r>
+      <w:proofErr w:type="spellStart"/>
+      <w:r>
+        <w:t>class</w:t>
+      </w:r>
+      <w:proofErr w:type="spellEnd"/>
+      <w:r>
+        <w:t>.</w:t>
       </w:r>
     </w:p>
     <w:p>
@@ -565,62 +619,10 @@
         <w:pStyle w:val="NormlWeb"/>
       </w:pPr>
       <w:r>
-        <w:t xml:space="preserve">Dóczi Adrián Márk: </w:t>
-      </w:r>
-      <w:proofErr w:type="spellStart"/>
-      <w:r>
-        <w:t>Material</w:t>
-      </w:r>
-      <w:proofErr w:type="spellEnd"/>
-      <w:r>
-        <w:t xml:space="preserve"> UI Design implementálása, Navigációs menü, Dinamikus betöltés, Gombok hozzáadása, Gombok stílusának konfigurálása,</w:t>
-      </w:r>
-      <w:r>
-        <w:t xml:space="preserve"> </w:t>
-      </w:r>
-      <w:r>
-        <w:t xml:space="preserve">saját </w:t>
-      </w:r>
-      <w:proofErr w:type="spellStart"/>
-      <w:r>
-        <w:t>árképzési</w:t>
-      </w:r>
-      <w:proofErr w:type="spellEnd"/>
-      <w:r>
-        <w:t xml:space="preserve"> logik</w:t>
-      </w:r>
-      <w:r>
-        <w:t>a,</w:t>
-      </w:r>
-      <w:r>
-        <w:t xml:space="preserve"> fő Szállás </w:t>
-      </w:r>
-      <w:proofErr w:type="spellStart"/>
-      <w:r>
-        <w:t>class</w:t>
-      </w:r>
-      <w:proofErr w:type="spellEnd"/>
-      <w:r>
-        <w:t>.</w:t>
-      </w:r>
-    </w:p>
-    <w:p>
-      <w:pPr>
-        <w:pStyle w:val="NormlWeb"/>
-      </w:pPr>
-      <w:proofErr w:type="spellStart"/>
-      <w:r>
-        <w:t>Bujáki</w:t>
-      </w:r>
-      <w:proofErr w:type="spellEnd"/>
-      <w:r>
-        <w:t xml:space="preserve"> Erik Attila: </w:t>
-      </w:r>
-      <w:r>
-        <w:t>fájlműveletek</w:t>
-      </w:r>
-      <w:r>
-        <w:t xml:space="preserve">, </w:t>
+        <w:t xml:space="preserve">Bujáki Erik Attila: </w:t>
+      </w:r>
+      <w:r>
+        <w:t xml:space="preserve">fájlműveletek, </w:t>
       </w:r>
       <w:r>
         <w:t xml:space="preserve">Vendégház, Panzió, </w:t>

</xml_diff>